<commit_message>
fix(office): harden real host formula validation
</commit_message>
<xml_diff>
--- a/docs/manual-acceptance-samples/LaTeXSnipper-Word-Editable-OLE.docx
+++ b/docs/manual-acceptance-samples/LaTeXSnipper-Word-Editable-OLE.docx
@@ -9,8 +9,8 @@
           <w:rFonts w:hint="eastAsia"/>
         </w:rPr>
         <w:alias w:val="LaTeXSnipper Formula"/>
-        <w:tag w:val="latexsnipper:formula:ec1d330a76f34feaa9753421e71f9a80"/>
-        <w:id w:val="1137296014"/>
+        <w:tag w:val="latexsnipper:formula:e0a87c0de8a84726bdd0d21803885e40"/>
+        <w:id w:val="-398291468"/>
         <w:placeholder>
           <w:docPart w:val="DefaultPlaceholder_-1854013440"/>
         </w:placeholder>
@@ -27,7 +27,7 @@
             <w:rPr>
               <w:rFonts w:hint="eastAsia"/>
             </w:rPr>
-            <w:object w:dxaOrig="437" w:dyaOrig="427" w14:anchorId="06DE1C20">
+            <w:object w:dxaOrig="437" w:dyaOrig="427" w14:anchorId="570521FD">
               <v:shapetype id="_x0000_t75" coordsize="21600,21600" o:spt="75" o:preferrelative="t" path="m@4@5l@4@11@9@11@9@5xe" filled="f" stroked="f">
                 <v:stroke joinstyle="miter"/>
                 <v:formulas>
@@ -50,7 +50,7 @@
               <v:shape id="_x0000_i1029" type="#_x0000_t75" style="width:22pt;height:21.5pt" o:ole="">
                 <v:imagedata r:id="rId5" o:title=""/>
               </v:shape>
-              <o:OLEObject Type="Embed" ProgID="Unknown" ShapeID="_x0000_i1029" DrawAspect="Content" ObjectID="_1847012172" r:id="rId6">
+              <o:OLEObject Type="Embed" ProgID="Unknown" ShapeID="_x0000_i1029" DrawAspect="Content" ObjectID="_1847204273" r:id="rId6">
                 <o:FieldCodes>\s</o:FieldCodes>
               </o:OLEObject>
             </w:object>
@@ -64,8 +64,8 @@
           <w:rFonts w:hint="eastAsia"/>
         </w:rPr>
         <w:alias w:val="LaTeXSnipper Formula"/>
-        <w:tag w:val="latexsnipper:formula:d7ddfa2c0aca4783a55ebe4bcad80de4"/>
-        <w:id w:val="1528909768"/>
+        <w:tag w:val="latexsnipper:formula:d4e96578cca9427cae4397de0b4275db"/>
+        <w:id w:val="474888285"/>
         <w:placeholder>
           <w:docPart w:val="DefaultPlaceholder_-1854013440"/>
         </w:placeholder>
@@ -83,11 +83,11 @@
             <w:rPr>
               <w:rFonts w:hint="eastAsia"/>
             </w:rPr>
-            <w:object w:dxaOrig="794" w:dyaOrig="854" w14:anchorId="6DE24E5F">
+            <w:object w:dxaOrig="794" w:dyaOrig="854" w14:anchorId="631C67CC">
               <v:shape id="_x0000_i1034" type="#_x0000_t75" style="width:39.5pt;height:42.5pt" o:ole="">
                 <v:imagedata r:id="rId7" o:title=""/>
               </v:shape>
-              <o:OLEObject Type="Embed" ProgID="Unknown" ShapeID="_x0000_i1034" DrawAspect="Content" ObjectID="_1847012173" r:id="rId8">
+              <o:OLEObject Type="Embed" ProgID="Unknown" ShapeID="_x0000_i1034" DrawAspect="Content" ObjectID="_1847204274" r:id="rId8">
                 <o:FieldCodes>\s</o:FieldCodes>
               </o:OLEObject>
             </w:object>
@@ -101,8 +101,8 @@
           <w:rFonts w:hint="eastAsia"/>
         </w:rPr>
         <w:alias w:val="LaTeXSnipper Numbered Formula"/>
-        <w:tag w:val="latexsnipper:formula:8b4dd5d0a42d40c29ff50a7ca3acf22d"/>
-        <w:id w:val="2029066267"/>
+        <w:tag w:val="latexsnipper:formula:4d6b74f4b5934f589786e72c877dbdad"/>
+        <w:id w:val="-1535117634"/>
         <w:placeholder>
           <w:docPart w:val="DefaultPlaceholder_-1854013440"/>
         </w:placeholder>
@@ -130,11 +130,11 @@
             <w:rPr>
               <w:rFonts w:hint="eastAsia"/>
             </w:rPr>
-            <w:object w:dxaOrig="794" w:dyaOrig="854" w14:anchorId="69DAC2FE">
+            <w:object w:dxaOrig="794" w:dyaOrig="854" w14:anchorId="7A8082C5">
               <v:shape id="_x0000_i1039" type="#_x0000_t75" style="width:39.5pt;height:42.5pt" o:ole="">
                 <v:imagedata r:id="rId7" o:title=""/>
               </v:shape>
-              <o:OLEObject Type="Embed" ProgID="Unknown" ShapeID="_x0000_i1039" DrawAspect="Content" ObjectID="_1847012174" r:id="rId9">
+              <o:OLEObject Type="Embed" ProgID="Unknown" ShapeID="_x0000_i1039" DrawAspect="Content" ObjectID="_1847204275" r:id="rId9">
                 <o:FieldCodes>\s</o:FieldCodes>
               </o:OLEObject>
             </w:object>
@@ -146,7 +146,7 @@
             <w:tab/>
             <w:t>(</w:t>
           </w:r>
-          <w:bookmarkStart w:id="0" w:name="LSNEq_8b4dd5d0a42d40c29ff50a7ca3acf22d"/>
+          <w:bookmarkStart w:id="0" w:name="LSNEq_4d6b74f4b5934f589786e72c877dbdad"/>
           <w:r>
             <w:rPr>
               <w:rFonts w:hint="eastAsia"/>
@@ -194,8 +194,8 @@
           <w:rFonts w:hint="eastAsia"/>
         </w:rPr>
         <w:alias w:val="LaTeXSnipper Formula"/>
-        <w:tag w:val="latexsnipper:formula:bd7163bcc9274efb947c6d390a311a72"/>
-        <w:id w:val="-1004512502"/>
+        <w:tag w:val="latexsnipper:formula:90494c9408c24dba8f91741493b2826a"/>
+        <w:id w:val="1060745520"/>
         <w:placeholder>
           <w:docPart w:val="DefaultPlaceholder_-1854013440"/>
         </w:placeholder>
@@ -217,11 +217,11 @@
             <w:rPr>
               <w:rFonts w:hint="eastAsia"/>
             </w:rPr>
-            <w:object w:dxaOrig="787" w:dyaOrig="427" w14:anchorId="6BD79F66">
+            <w:object w:dxaOrig="787" w:dyaOrig="427" w14:anchorId="5D5DA6DA">
               <v:shape id="_x0000_i1047" type="#_x0000_t75" style="width:39.5pt;height:21.5pt" o:ole="">
                 <v:imagedata r:id="rId10" o:title=""/>
               </v:shape>
-              <o:OLEObject Type="Embed" ProgID="Unknown" ShapeID="_x0000_i1047" DrawAspect="Content" ObjectID="_1847012175" r:id="rId11">
+              <o:OLEObject Type="Embed" ProgID="Unknown" ShapeID="_x0000_i1047" DrawAspect="Content" ObjectID="_1847204276" r:id="rId11">
                 <o:FieldCodes>\s</o:FieldCodes>
               </o:OLEObject>
             </w:object>
@@ -235,8 +235,8 @@
           <w:rFonts w:hint="eastAsia"/>
         </w:rPr>
         <w:alias w:val="LaTeXSnipper Formula"/>
-        <w:tag w:val="latexsnipper:formula:9cd83a7283da412789d8dce3a691b97c"/>
-        <w:id w:val="2026361276"/>
+        <w:tag w:val="latexsnipper:formula:55db5e5086914be3997d207b87978614"/>
+        <w:id w:val="615641333"/>
         <w:placeholder>
           <w:docPart w:val="DefaultPlaceholder_-1854013440"/>
         </w:placeholder>
@@ -258,11 +258,11 @@
             <w:rPr>
               <w:rFonts w:hint="eastAsia"/>
             </w:rPr>
-            <w:object w:dxaOrig="1494" w:dyaOrig="854" w14:anchorId="4F983620">
+            <w:object w:dxaOrig="1494" w:dyaOrig="854" w14:anchorId="6AEA76A0">
               <v:shape id="_x0000_i1052" type="#_x0000_t75" style="width:74.5pt;height:42.5pt" o:ole="">
                 <v:imagedata r:id="rId12" o:title=""/>
               </v:shape>
-              <o:OLEObject Type="Embed" ProgID="Unknown" ShapeID="_x0000_i1052" DrawAspect="Content" ObjectID="_1847012176" r:id="rId13">
+              <o:OLEObject Type="Embed" ProgID="Unknown" ShapeID="_x0000_i1052" DrawAspect="Content" ObjectID="_1847204277" r:id="rId13">
                 <o:FieldCodes>\s</o:FieldCodes>
               </o:OLEObject>
             </w:object>
@@ -276,8 +276,8 @@
           <w:rFonts w:hint="eastAsia"/>
         </w:rPr>
         <w:alias w:val="LaTeXSnipper Numbered Formula"/>
-        <w:tag w:val="latexsnipper:formula:dcb961cb2f6641a4868a7e5c39b96656"/>
-        <w:id w:val="68541310"/>
+        <w:tag w:val="latexsnipper:formula:302814f4ba334950ad82ac565cd6d47c"/>
+        <w:id w:val="45802005"/>
         <w:placeholder>
           <w:docPart w:val="DefaultPlaceholder_-1854013440"/>
         </w:placeholder>
@@ -305,11 +305,11 @@
             <w:rPr>
               <w:rFonts w:hint="eastAsia"/>
             </w:rPr>
-            <w:object w:dxaOrig="1494" w:dyaOrig="854" w14:anchorId="2AB6C370">
+            <w:object w:dxaOrig="1494" w:dyaOrig="854" w14:anchorId="612FE387">
               <v:shape id="_x0000_i1057" type="#_x0000_t75" style="width:74.5pt;height:42.5pt" o:ole="">
                 <v:imagedata r:id="rId12" o:title=""/>
               </v:shape>
-              <o:OLEObject Type="Embed" ProgID="Unknown" ShapeID="_x0000_i1057" DrawAspect="Content" ObjectID="_1847012177" r:id="rId14">
+              <o:OLEObject Type="Embed" ProgID="Unknown" ShapeID="_x0000_i1057" DrawAspect="Content" ObjectID="_1847204278" r:id="rId14">
                 <o:FieldCodes>\s</o:FieldCodes>
               </o:OLEObject>
             </w:object>
@@ -321,7 +321,7 @@
             <w:tab/>
             <w:t>(</w:t>
           </w:r>
-          <w:bookmarkStart w:id="1" w:name="LSNEq_dcb961cb2f6641a4868a7e5c39b96656"/>
+          <w:bookmarkStart w:id="1" w:name="LSNEq_302814f4ba334950ad82ac565cd6d47c"/>
           <w:r>
             <w:rPr>
               <w:rFonts w:hint="eastAsia"/>
@@ -369,8 +369,8 @@
           <w:rFonts w:hint="eastAsia"/>
         </w:rPr>
         <w:alias w:val="LaTeXSnipper Formula"/>
-        <w:tag w:val="latexsnipper:formula:a794cd2cf5a7415888e5c6e3091c39a8"/>
-        <w:id w:val="-200326393"/>
+        <w:tag w:val="latexsnipper:formula:8632fcb77a0b4648a76290f7cac37192"/>
+        <w:id w:val="1486512913"/>
         <w:placeholder>
           <w:docPart w:val="DefaultPlaceholder_-1854013440"/>
         </w:placeholder>
@@ -392,11 +392,11 @@
             <w:rPr>
               <w:rFonts w:hint="eastAsia"/>
             </w:rPr>
-            <w:object w:dxaOrig="1414" w:dyaOrig="427" w14:anchorId="41DF202A">
+            <w:object w:dxaOrig="1414" w:dyaOrig="427" w14:anchorId="7BBBCD87">
               <v:shape id="_x0000_i1065" type="#_x0000_t75" style="width:70.5pt;height:21.5pt" o:ole="">
                 <v:imagedata r:id="rId15" o:title=""/>
               </v:shape>
-              <o:OLEObject Type="Embed" ProgID="Unknown" ShapeID="_x0000_i1065" DrawAspect="Content" ObjectID="_1847012178" r:id="rId16">
+              <o:OLEObject Type="Embed" ProgID="Unknown" ShapeID="_x0000_i1065" DrawAspect="Content" ObjectID="_1847204279" r:id="rId16">
                 <o:FieldCodes>\s</o:FieldCodes>
               </o:OLEObject>
             </w:object>
@@ -410,8 +410,8 @@
           <w:rFonts w:hint="eastAsia"/>
         </w:rPr>
         <w:alias w:val="LaTeXSnipper Formula"/>
-        <w:tag w:val="latexsnipper:formula:534ddd95cf2e491287c67c974a432b6a"/>
-        <w:id w:val="-62487574"/>
+        <w:tag w:val="latexsnipper:formula:6a50d15ef40249c787072084bde3f5e1"/>
+        <w:id w:val="851844570"/>
         <w:placeholder>
           <w:docPart w:val="DefaultPlaceholder_-1854013440"/>
         </w:placeholder>
@@ -433,11 +433,11 @@
             <w:rPr>
               <w:rFonts w:hint="eastAsia"/>
             </w:rPr>
-            <w:object w:dxaOrig="2776" w:dyaOrig="854" w14:anchorId="123971BE">
+            <w:object w:dxaOrig="2776" w:dyaOrig="854" w14:anchorId="6C321F84">
               <v:shape id="_x0000_i1070" type="#_x0000_t75" style="width:139pt;height:42.5pt" o:ole="">
                 <v:imagedata r:id="rId17" o:title=""/>
               </v:shape>
-              <o:OLEObject Type="Embed" ProgID="Unknown" ShapeID="_x0000_i1070" DrawAspect="Content" ObjectID="_1847012179" r:id="rId18">
+              <o:OLEObject Type="Embed" ProgID="Unknown" ShapeID="_x0000_i1070" DrawAspect="Content" ObjectID="_1847204280" r:id="rId18">
                 <o:FieldCodes>\s</o:FieldCodes>
               </o:OLEObject>
             </w:object>
@@ -451,8 +451,8 @@
           <w:rFonts w:hint="eastAsia"/>
         </w:rPr>
         <w:alias w:val="LaTeXSnipper Numbered Formula"/>
-        <w:tag w:val="latexsnipper:formula:43875f501d67458aa9a1c53ddb62385a"/>
-        <w:id w:val="-1783109496"/>
+        <w:tag w:val="latexsnipper:formula:e14273091b3447a4868717623b926d12"/>
+        <w:id w:val="-958029120"/>
         <w:placeholder>
           <w:docPart w:val="DefaultPlaceholder_-1854013440"/>
         </w:placeholder>
@@ -480,11 +480,11 @@
             <w:rPr>
               <w:rFonts w:hint="eastAsia"/>
             </w:rPr>
-            <w:object w:dxaOrig="2776" w:dyaOrig="854" w14:anchorId="0624DB5D">
+            <w:object w:dxaOrig="2776" w:dyaOrig="854" w14:anchorId="6AE523D7">
               <v:shape id="_x0000_i1075" type="#_x0000_t75" style="width:139pt;height:42.5pt" o:ole="">
                 <v:imagedata r:id="rId17" o:title=""/>
               </v:shape>
-              <o:OLEObject Type="Embed" ProgID="Unknown" ShapeID="_x0000_i1075" DrawAspect="Content" ObjectID="_1847012180" r:id="rId19">
+              <o:OLEObject Type="Embed" ProgID="Unknown" ShapeID="_x0000_i1075" DrawAspect="Content" ObjectID="_1847204281" r:id="rId19">
                 <o:FieldCodes>\s</o:FieldCodes>
               </o:OLEObject>
             </w:object>
@@ -496,7 +496,7 @@
             <w:tab/>
             <w:t>(</w:t>
           </w:r>
-          <w:bookmarkStart w:id="2" w:name="LSNEq_43875f501d67458aa9a1c53ddb62385a"/>
+          <w:bookmarkStart w:id="2" w:name="LSNEq_e14273091b3447a4868717623b926d12"/>
           <w:r>
             <w:rPr>
               <w:rFonts w:hint="eastAsia"/>
@@ -544,8 +544,8 @@
           <w:rFonts w:hint="eastAsia"/>
         </w:rPr>
         <w:alias w:val="LaTeXSnipper Formula"/>
-        <w:tag w:val="latexsnipper:formula:1c042225ef854f7089d83c79cccad10c"/>
-        <w:id w:val="-219293346"/>
+        <w:tag w:val="latexsnipper:formula:3d0627d57a5c4fd78930540067737789"/>
+        <w:id w:val="-1081216802"/>
         <w:placeholder>
           <w:docPart w:val="DefaultPlaceholder_-1854013440"/>
         </w:placeholder>
@@ -567,11 +567,11 @@
             <w:rPr>
               <w:rFonts w:hint="eastAsia"/>
             </w:rPr>
-            <w:object w:dxaOrig="1269" w:dyaOrig="427" w14:anchorId="055B37D9">
+            <w:object w:dxaOrig="1269" w:dyaOrig="427" w14:anchorId="1C632A30">
               <v:shape id="_x0000_i1083" type="#_x0000_t75" style="width:63.5pt;height:21.5pt" o:ole="">
                 <v:imagedata r:id="rId20" o:title=""/>
               </v:shape>
-              <o:OLEObject Type="Embed" ProgID="Unknown" ShapeID="_x0000_i1083" DrawAspect="Content" ObjectID="_1847012181" r:id="rId21">
+              <o:OLEObject Type="Embed" ProgID="Unknown" ShapeID="_x0000_i1083" DrawAspect="Content" ObjectID="_1847204282" r:id="rId21">
                 <o:FieldCodes>\s</o:FieldCodes>
               </o:OLEObject>
             </w:object>
@@ -585,8 +585,8 @@
           <w:rFonts w:hint="eastAsia"/>
         </w:rPr>
         <w:alias w:val="LaTeXSnipper Formula"/>
-        <w:tag w:val="latexsnipper:formula:00bbc087cb284e8482835c55acca09cb"/>
-        <w:id w:val="1836874531"/>
+        <w:tag w:val="latexsnipper:formula:6d3194a84b2848bd9f722ddd953019dd"/>
+        <w:id w:val="975563278"/>
         <w:placeholder>
           <w:docPart w:val="DefaultPlaceholder_-1854013440"/>
         </w:placeholder>
@@ -608,11 +608,11 @@
             <w:rPr>
               <w:rFonts w:hint="eastAsia"/>
             </w:rPr>
-            <w:object w:dxaOrig="2476" w:dyaOrig="854" w14:anchorId="0FB0E93B">
+            <w:object w:dxaOrig="2476" w:dyaOrig="854" w14:anchorId="647044C0">
               <v:shape id="_x0000_i1088" type="#_x0000_t75" style="width:124pt;height:42.5pt" o:ole="">
                 <v:imagedata r:id="rId22" o:title=""/>
               </v:shape>
-              <o:OLEObject Type="Embed" ProgID="Unknown" ShapeID="_x0000_i1088" DrawAspect="Content" ObjectID="_1847012182" r:id="rId23">
+              <o:OLEObject Type="Embed" ProgID="Unknown" ShapeID="_x0000_i1088" DrawAspect="Content" ObjectID="_1847204283" r:id="rId23">
                 <o:FieldCodes>\s</o:FieldCodes>
               </o:OLEObject>
             </w:object>
@@ -626,8 +626,8 @@
           <w:rFonts w:hint="eastAsia"/>
         </w:rPr>
         <w:alias w:val="LaTeXSnipper Numbered Formula"/>
-        <w:tag w:val="latexsnipper:formula:5d5efc9856c04a12bb5f2b2fb9d04fd0"/>
-        <w:id w:val="-986395553"/>
+        <w:tag w:val="latexsnipper:formula:704c1e5a9f2847b3869bf9b26914c04e"/>
+        <w:id w:val="334966527"/>
         <w:placeholder>
           <w:docPart w:val="DefaultPlaceholder_-1854013440"/>
         </w:placeholder>
@@ -655,11 +655,11 @@
             <w:rPr>
               <w:rFonts w:hint="eastAsia"/>
             </w:rPr>
-            <w:object w:dxaOrig="2476" w:dyaOrig="854" w14:anchorId="23BFC3E7">
+            <w:object w:dxaOrig="2476" w:dyaOrig="854" w14:anchorId="43016E9E">
               <v:shape id="_x0000_i1093" type="#_x0000_t75" style="width:124pt;height:42.5pt" o:ole="">
                 <v:imagedata r:id="rId22" o:title=""/>
               </v:shape>
-              <o:OLEObject Type="Embed" ProgID="Unknown" ShapeID="_x0000_i1093" DrawAspect="Content" ObjectID="_1847012183" r:id="rId24">
+              <o:OLEObject Type="Embed" ProgID="Unknown" ShapeID="_x0000_i1093" DrawAspect="Content" ObjectID="_1847204284" r:id="rId24">
                 <o:FieldCodes>\s</o:FieldCodes>
               </o:OLEObject>
             </w:object>
@@ -671,7 +671,7 @@
             <w:tab/>
             <w:t>(</w:t>
           </w:r>
-          <w:bookmarkStart w:id="3" w:name="LSNEq_5d5efc9856c04a12bb5f2b2fb9d04fd0"/>
+          <w:bookmarkStart w:id="3" w:name="LSNEq_704c1e5a9f2847b3869bf9b26914c04e"/>
           <w:r>
             <w:rPr>
               <w:rFonts w:hint="eastAsia"/>
@@ -719,8 +719,8 @@
           <w:rFonts w:hint="eastAsia"/>
         </w:rPr>
         <w:alias w:val="LaTeXSnipper Formula"/>
-        <w:tag w:val="latexsnipper:formula:0882ec11366f448781c463049dcae2c0"/>
-        <w:id w:val="1935465572"/>
+        <w:tag w:val="latexsnipper:formula:30c88d8341b340f3873cd1e10fbb489c"/>
+        <w:id w:val="222098787"/>
         <w:placeholder>
           <w:docPart w:val="DefaultPlaceholder_-1854013440"/>
         </w:placeholder>
@@ -742,11 +742,11 @@
             <w:rPr>
               <w:rFonts w:hint="eastAsia"/>
             </w:rPr>
-            <w:object w:dxaOrig="7701" w:dyaOrig="163" w14:anchorId="23161C7E">
+            <w:object w:dxaOrig="7701" w:dyaOrig="163" w14:anchorId="3536ED4C">
               <v:shape id="_x0000_i1101" type="#_x0000_t75" style="width:385pt;height:8pt" o:ole="">
                 <v:imagedata r:id="rId25" o:title=""/>
               </v:shape>
-              <o:OLEObject Type="Embed" ProgID="Unknown" ShapeID="_x0000_i1101" DrawAspect="Content" ObjectID="_1847012184" r:id="rId26">
+              <o:OLEObject Type="Embed" ProgID="Unknown" ShapeID="_x0000_i1101" DrawAspect="Content" ObjectID="_1847204285" r:id="rId26">
                 <o:FieldCodes>\s</o:FieldCodes>
               </o:OLEObject>
             </w:object>
@@ -760,8 +760,8 @@
           <w:rFonts w:hint="eastAsia"/>
         </w:rPr>
         <w:alias w:val="LaTeXSnipper Formula"/>
-        <w:tag w:val="latexsnipper:formula:6016153ec3894704968bf377daa7429f"/>
-        <w:id w:val="-1435887501"/>
+        <w:tag w:val="latexsnipper:formula:2a97755e8fcd4731aea2633647caef23"/>
+        <w:id w:val="-1764758729"/>
         <w:placeholder>
           <w:docPart w:val="DefaultPlaceholder_-1854013440"/>
         </w:placeholder>
@@ -783,11 +783,11 @@
             <w:rPr>
               <w:rFonts w:hint="eastAsia"/>
             </w:rPr>
-            <w:object w:dxaOrig="7701" w:dyaOrig="163" w14:anchorId="79B3AD9C">
+            <w:object w:dxaOrig="7701" w:dyaOrig="163" w14:anchorId="4FD14E19">
               <v:shape id="_x0000_i1106" type="#_x0000_t75" style="width:385pt;height:8pt" o:ole="">
                 <v:imagedata r:id="rId25" o:title=""/>
               </v:shape>
-              <o:OLEObject Type="Embed" ProgID="Unknown" ShapeID="_x0000_i1106" DrawAspect="Content" ObjectID="_1847012185" r:id="rId27">
+              <o:OLEObject Type="Embed" ProgID="Unknown" ShapeID="_x0000_i1106" DrawAspect="Content" ObjectID="_1847204286" r:id="rId27">
                 <o:FieldCodes>\s</o:FieldCodes>
               </o:OLEObject>
             </w:object>
@@ -801,8 +801,8 @@
           <w:rFonts w:hint="eastAsia"/>
         </w:rPr>
         <w:alias w:val="LaTeXSnipper Numbered Formula"/>
-        <w:tag w:val="latexsnipper:formula:e86aba83fb424474bfa4eaf2b22e47db"/>
-        <w:id w:val="2116394608"/>
+        <w:tag w:val="latexsnipper:formula:d2b37b9aa58d46d1b814c38a2d4a3d1b"/>
+        <w:id w:val="181707597"/>
         <w:placeholder>
           <w:docPart w:val="DefaultPlaceholder_-1854013440"/>
         </w:placeholder>
@@ -830,11 +830,11 @@
             <w:rPr>
               <w:rFonts w:hint="eastAsia"/>
             </w:rPr>
-            <w:object w:dxaOrig="7701" w:dyaOrig="163" w14:anchorId="551F38DD">
+            <w:object w:dxaOrig="7701" w:dyaOrig="163" w14:anchorId="51D9BB4B">
               <v:shape id="_x0000_i1111" type="#_x0000_t75" style="width:385pt;height:8pt" o:ole="">
                 <v:imagedata r:id="rId25" o:title=""/>
               </v:shape>
-              <o:OLEObject Type="Embed" ProgID="Unknown" ShapeID="_x0000_i1111" DrawAspect="Content" ObjectID="_1847012186" r:id="rId28">
+              <o:OLEObject Type="Embed" ProgID="Unknown" ShapeID="_x0000_i1111" DrawAspect="Content" ObjectID="_1847204287" r:id="rId28">
                 <o:FieldCodes>\s</o:FieldCodes>
               </o:OLEObject>
             </w:object>
@@ -846,7 +846,7 @@
             <w:tab/>
             <w:t>(</w:t>
           </w:r>
-          <w:bookmarkStart w:id="4" w:name="LSNEq_e86aba83fb424474bfa4eaf2b22e47db"/>
+          <w:bookmarkStart w:id="4" w:name="LSNEq_d2b37b9aa58d46d1b814c38a2d4a3d1b"/>
           <w:r>
             <w:rPr>
               <w:rFonts w:hint="eastAsia"/>
@@ -894,8 +894,8 @@
           <w:rFonts w:hint="eastAsia"/>
         </w:rPr>
         <w:alias w:val="LaTeXSnipper Formula"/>
-        <w:tag w:val="latexsnipper:formula:8a0926c8eb664f8db577db0e95c0f969"/>
-        <w:id w:val="-937449205"/>
+        <w:tag w:val="latexsnipper:formula:c9f456c09526453095a5e53c907fe980"/>
+        <w:id w:val="-783725661"/>
         <w:placeholder>
           <w:docPart w:val="DefaultPlaceholder_-1854013440"/>
         </w:placeholder>
@@ -917,11 +917,11 @@
             <w:rPr>
               <w:rFonts w:hint="eastAsia"/>
             </w:rPr>
-            <w:object w:dxaOrig="7701" w:dyaOrig="3942" w14:anchorId="19B0586B">
+            <w:object w:dxaOrig="7701" w:dyaOrig="3942" w14:anchorId="53E6D476">
               <v:shape id="_x0000_i1119" type="#_x0000_t75" style="width:385pt;height:197pt" o:ole="">
                 <v:imagedata r:id="rId29" o:title=""/>
               </v:shape>
-              <o:OLEObject Type="Embed" ProgID="Unknown" ShapeID="_x0000_i1119" DrawAspect="Content" ObjectID="_1847012187" r:id="rId30">
+              <o:OLEObject Type="Embed" ProgID="Unknown" ShapeID="_x0000_i1119" DrawAspect="Content" ObjectID="_1847204288" r:id="rId30">
                 <o:FieldCodes>\s</o:FieldCodes>
               </o:OLEObject>
             </w:object>
@@ -935,8 +935,8 @@
           <w:rFonts w:hint="eastAsia"/>
         </w:rPr>
         <w:alias w:val="LaTeXSnipper Formula"/>
-        <w:tag w:val="latexsnipper:formula:55a7bdb781014e02925f45041dbe234a"/>
-        <w:id w:val="-1888713137"/>
+        <w:tag w:val="latexsnipper:formula:a180bea120b64ce594a0512e14b9bab4"/>
+        <w:id w:val="1229110195"/>
         <w:placeholder>
           <w:docPart w:val="DefaultPlaceholder_-1854013440"/>
         </w:placeholder>
@@ -958,11 +958,11 @@
             <w:rPr>
               <w:rFonts w:hint="eastAsia"/>
             </w:rPr>
-            <w:object w:dxaOrig="7701" w:dyaOrig="3942" w14:anchorId="7E0DC0AD">
+            <w:object w:dxaOrig="7701" w:dyaOrig="3942" w14:anchorId="2E04FCC3">
               <v:shape id="_x0000_i1124" type="#_x0000_t75" style="width:385pt;height:197pt" o:ole="">
                 <v:imagedata r:id="rId29" o:title=""/>
               </v:shape>
-              <o:OLEObject Type="Embed" ProgID="Unknown" ShapeID="_x0000_i1124" DrawAspect="Content" ObjectID="_1847012188" r:id="rId31">
+              <o:OLEObject Type="Embed" ProgID="Unknown" ShapeID="_x0000_i1124" DrawAspect="Content" ObjectID="_1847204289" r:id="rId31">
                 <o:FieldCodes>\s</o:FieldCodes>
               </o:OLEObject>
             </w:object>
@@ -976,8 +976,8 @@
           <w:rFonts w:hint="eastAsia"/>
         </w:rPr>
         <w:alias w:val="LaTeXSnipper Numbered Formula"/>
-        <w:tag w:val="latexsnipper:formula:383b9b11d40a4097832e446ce4d0022d"/>
-        <w:id w:val="-1186672177"/>
+        <w:tag w:val="latexsnipper:formula:59bbab87267a41bda0453a473bacf9eb"/>
+        <w:id w:val="-1618901273"/>
         <w:placeholder>
           <w:docPart w:val="DefaultPlaceholder_-1854013440"/>
         </w:placeholder>
@@ -1002,11 +1002,11 @@
             <w:rPr>
               <w:rFonts w:hint="eastAsia"/>
             </w:rPr>
-            <w:object w:dxaOrig="7701" w:dyaOrig="3942" w14:anchorId="0F492644">
+            <w:object w:dxaOrig="7701" w:dyaOrig="3942" w14:anchorId="467824F9">
               <v:shape id="_x0000_i1129" type="#_x0000_t75" style="width:385pt;height:197pt" o:ole="">
                 <v:imagedata r:id="rId29" o:title=""/>
               </v:shape>
-              <o:OLEObject Type="Embed" ProgID="Unknown" ShapeID="_x0000_i1129" DrawAspect="Content" ObjectID="_1847012189" r:id="rId32">
+              <o:OLEObject Type="Embed" ProgID="Unknown" ShapeID="_x0000_i1129" DrawAspect="Content" ObjectID="_1847204290" r:id="rId32">
                 <o:FieldCodes>\s</o:FieldCodes>
               </o:OLEObject>
             </w:object>
@@ -1018,7 +1018,7 @@
             <w:tab/>
             <w:t>(</w:t>
           </w:r>
-          <w:bookmarkStart w:id="5" w:name="LSNEq_383b9b11d40a4097832e446ce4d0022d"/>
+          <w:bookmarkStart w:id="5" w:name="LSNEq_59bbab87267a41bda0453a473bacf9eb"/>
           <w:r>
             <w:rPr>
               <w:rFonts w:hint="eastAsia"/>
@@ -1481,7 +1481,7 @@
     <w:link w:val="10"/>
     <w:uiPriority w:val="9"/>
     <w:qFormat/>
-    <w:rsid w:val="004927C4"/>
+    <w:rsid w:val="00210DA9"/>
     <w:pPr>
       <w:keepNext/>
       <w:keepLines/>
@@ -1504,7 +1504,7 @@
     <w:semiHidden/>
     <w:unhideWhenUsed/>
     <w:qFormat/>
-    <w:rsid w:val="004927C4"/>
+    <w:rsid w:val="00210DA9"/>
     <w:pPr>
       <w:keepNext/>
       <w:keepLines/>
@@ -1527,7 +1527,7 @@
     <w:semiHidden/>
     <w:unhideWhenUsed/>
     <w:qFormat/>
-    <w:rsid w:val="004927C4"/>
+    <w:rsid w:val="00210DA9"/>
     <w:pPr>
       <w:keepNext/>
       <w:keepLines/>
@@ -1550,7 +1550,7 @@
     <w:semiHidden/>
     <w:unhideWhenUsed/>
     <w:qFormat/>
-    <w:rsid w:val="004927C4"/>
+    <w:rsid w:val="00210DA9"/>
     <w:pPr>
       <w:keepNext/>
       <w:keepLines/>
@@ -1573,7 +1573,7 @@
     <w:semiHidden/>
     <w:unhideWhenUsed/>
     <w:qFormat/>
-    <w:rsid w:val="004927C4"/>
+    <w:rsid w:val="00210DA9"/>
     <w:pPr>
       <w:keepNext/>
       <w:keepLines/>
@@ -1595,7 +1595,7 @@
     <w:semiHidden/>
     <w:unhideWhenUsed/>
     <w:qFormat/>
-    <w:rsid w:val="004927C4"/>
+    <w:rsid w:val="00210DA9"/>
     <w:pPr>
       <w:keepNext/>
       <w:keepLines/>
@@ -1618,7 +1618,7 @@
     <w:semiHidden/>
     <w:unhideWhenUsed/>
     <w:qFormat/>
-    <w:rsid w:val="004927C4"/>
+    <w:rsid w:val="00210DA9"/>
     <w:pPr>
       <w:keepNext/>
       <w:keepLines/>
@@ -1641,7 +1641,7 @@
     <w:semiHidden/>
     <w:unhideWhenUsed/>
     <w:qFormat/>
-    <w:rsid w:val="004927C4"/>
+    <w:rsid w:val="00210DA9"/>
     <w:pPr>
       <w:keepNext/>
       <w:keepLines/>
@@ -1662,7 +1662,7 @@
     <w:semiHidden/>
     <w:unhideWhenUsed/>
     <w:qFormat/>
-    <w:rsid w:val="004927C4"/>
+    <w:rsid w:val="00210DA9"/>
     <w:pPr>
       <w:keepNext/>
       <w:keepLines/>
@@ -1706,7 +1706,7 @@
     <w:basedOn w:val="a0"/>
     <w:link w:val="1"/>
     <w:uiPriority w:val="9"/>
-    <w:rsid w:val="004927C4"/>
+    <w:rsid w:val="00210DA9"/>
     <w:rPr>
       <w:rFonts w:asciiTheme="majorHAnsi" w:eastAsiaTheme="majorEastAsia" w:hAnsiTheme="majorHAnsi" w:cstheme="majorBidi"/>
       <w:color w:val="0F4761" w:themeColor="accent1" w:themeShade="BF"/>
@@ -1720,7 +1720,7 @@
     <w:link w:val="2"/>
     <w:uiPriority w:val="9"/>
     <w:semiHidden/>
-    <w:rsid w:val="004927C4"/>
+    <w:rsid w:val="00210DA9"/>
     <w:rPr>
       <w:rFonts w:asciiTheme="majorHAnsi" w:eastAsiaTheme="majorEastAsia" w:hAnsiTheme="majorHAnsi" w:cstheme="majorBidi"/>
       <w:color w:val="0F4761" w:themeColor="accent1" w:themeShade="BF"/>
@@ -1734,7 +1734,7 @@
     <w:link w:val="3"/>
     <w:uiPriority w:val="9"/>
     <w:semiHidden/>
-    <w:rsid w:val="004927C4"/>
+    <w:rsid w:val="00210DA9"/>
     <w:rPr>
       <w:rFonts w:asciiTheme="majorHAnsi" w:eastAsiaTheme="majorEastAsia" w:hAnsiTheme="majorHAnsi" w:cstheme="majorBidi"/>
       <w:color w:val="0F4761" w:themeColor="accent1" w:themeShade="BF"/>
@@ -1748,7 +1748,7 @@
     <w:link w:val="4"/>
     <w:uiPriority w:val="9"/>
     <w:semiHidden/>
-    <w:rsid w:val="004927C4"/>
+    <w:rsid w:val="00210DA9"/>
     <w:rPr>
       <w:rFonts w:cstheme="majorBidi"/>
       <w:color w:val="0F4761" w:themeColor="accent1" w:themeShade="BF"/>
@@ -1762,7 +1762,7 @@
     <w:link w:val="5"/>
     <w:uiPriority w:val="9"/>
     <w:semiHidden/>
-    <w:rsid w:val="004927C4"/>
+    <w:rsid w:val="00210DA9"/>
     <w:rPr>
       <w:rFonts w:cstheme="majorBidi"/>
       <w:color w:val="0F4761" w:themeColor="accent1" w:themeShade="BF"/>
@@ -1775,7 +1775,7 @@
     <w:link w:val="6"/>
     <w:uiPriority w:val="9"/>
     <w:semiHidden/>
-    <w:rsid w:val="004927C4"/>
+    <w:rsid w:val="00210DA9"/>
     <w:rPr>
       <w:rFonts w:cstheme="majorBidi"/>
       <w:b/>
@@ -1789,7 +1789,7 @@
     <w:link w:val="7"/>
     <w:uiPriority w:val="9"/>
     <w:semiHidden/>
-    <w:rsid w:val="004927C4"/>
+    <w:rsid w:val="00210DA9"/>
     <w:rPr>
       <w:rFonts w:cstheme="majorBidi"/>
       <w:b/>
@@ -1803,7 +1803,7 @@
     <w:link w:val="8"/>
     <w:uiPriority w:val="9"/>
     <w:semiHidden/>
-    <w:rsid w:val="004927C4"/>
+    <w:rsid w:val="00210DA9"/>
     <w:rPr>
       <w:rFonts w:cstheme="majorBidi"/>
       <w:color w:val="595959" w:themeColor="text1" w:themeTint="A6"/>
@@ -1815,7 +1815,7 @@
     <w:link w:val="9"/>
     <w:uiPriority w:val="9"/>
     <w:semiHidden/>
-    <w:rsid w:val="004927C4"/>
+    <w:rsid w:val="00210DA9"/>
     <w:rPr>
       <w:rFonts w:eastAsiaTheme="majorEastAsia" w:cstheme="majorBidi"/>
       <w:color w:val="595959" w:themeColor="text1" w:themeTint="A6"/>
@@ -1828,7 +1828,7 @@
     <w:link w:val="a4"/>
     <w:uiPriority w:val="10"/>
     <w:qFormat/>
-    <w:rsid w:val="004927C4"/>
+    <w:rsid w:val="00210DA9"/>
     <w:pPr>
       <w:spacing w:after="80" w:line="240" w:lineRule="auto"/>
       <w:contextualSpacing/>
@@ -1847,7 +1847,7 @@
     <w:basedOn w:val="a0"/>
     <w:link w:val="a3"/>
     <w:uiPriority w:val="10"/>
-    <w:rsid w:val="004927C4"/>
+    <w:rsid w:val="00210DA9"/>
     <w:rPr>
       <w:rFonts w:asciiTheme="majorHAnsi" w:eastAsiaTheme="majorEastAsia" w:hAnsiTheme="majorHAnsi" w:cstheme="majorBidi"/>
       <w:spacing w:val="-10"/>
@@ -1863,7 +1863,7 @@
     <w:link w:val="a6"/>
     <w:uiPriority w:val="11"/>
     <w:qFormat/>
-    <w:rsid w:val="004927C4"/>
+    <w:rsid w:val="00210DA9"/>
     <w:pPr>
       <w:numPr>
         <w:ilvl w:val="1"/>
@@ -1883,7 +1883,7 @@
     <w:basedOn w:val="a0"/>
     <w:link w:val="a5"/>
     <w:uiPriority w:val="11"/>
-    <w:rsid w:val="004927C4"/>
+    <w:rsid w:val="00210DA9"/>
     <w:rPr>
       <w:rFonts w:asciiTheme="majorHAnsi" w:eastAsiaTheme="majorEastAsia" w:hAnsiTheme="majorHAnsi" w:cstheme="majorBidi"/>
       <w:color w:val="595959" w:themeColor="text1" w:themeTint="A6"/>
@@ -1899,7 +1899,7 @@
     <w:link w:val="a8"/>
     <w:uiPriority w:val="29"/>
     <w:qFormat/>
-    <w:rsid w:val="004927C4"/>
+    <w:rsid w:val="00210DA9"/>
     <w:pPr>
       <w:spacing w:before="160"/>
       <w:jc w:val="center"/>
@@ -1915,7 +1915,7 @@
     <w:basedOn w:val="a0"/>
     <w:link w:val="a7"/>
     <w:uiPriority w:val="29"/>
-    <w:rsid w:val="004927C4"/>
+    <w:rsid w:val="00210DA9"/>
     <w:rPr>
       <w:i/>
       <w:iCs/>
@@ -1927,7 +1927,7 @@
     <w:basedOn w:val="a"/>
     <w:uiPriority w:val="34"/>
     <w:qFormat/>
-    <w:rsid w:val="004927C4"/>
+    <w:rsid w:val="00210DA9"/>
     <w:pPr>
       <w:ind w:left="720"/>
       <w:contextualSpacing/>
@@ -1938,7 +1938,7 @@
     <w:basedOn w:val="a0"/>
     <w:uiPriority w:val="21"/>
     <w:qFormat/>
-    <w:rsid w:val="004927C4"/>
+    <w:rsid w:val="00210DA9"/>
     <w:rPr>
       <w:i/>
       <w:iCs/>
@@ -1952,7 +1952,7 @@
     <w:link w:val="ac"/>
     <w:uiPriority w:val="30"/>
     <w:qFormat/>
-    <w:rsid w:val="004927C4"/>
+    <w:rsid w:val="00210DA9"/>
     <w:pPr>
       <w:pBdr>
         <w:top w:val="single" w:sz="4" w:space="10" w:color="0F4761" w:themeColor="accent1" w:themeShade="BF"/>
@@ -1973,7 +1973,7 @@
     <w:basedOn w:val="a0"/>
     <w:link w:val="ab"/>
     <w:uiPriority w:val="30"/>
-    <w:rsid w:val="004927C4"/>
+    <w:rsid w:val="00210DA9"/>
     <w:rPr>
       <w:i/>
       <w:iCs/>
@@ -1985,7 +1985,7 @@
     <w:basedOn w:val="a0"/>
     <w:uiPriority w:val="32"/>
     <w:qFormat/>
-    <w:rsid w:val="004927C4"/>
+    <w:rsid w:val="00210DA9"/>
     <w:rPr>
       <w:b/>
       <w:bCs/>
@@ -1999,7 +1999,7 @@
     <w:basedOn w:val="a0"/>
     <w:uiPriority w:val="99"/>
     <w:semiHidden/>
-    <w:rsid w:val="004927C4"/>
+    <w:rsid w:val="00210DA9"/>
     <w:rPr>
       <w:color w:val="666666"/>
     </w:rPr>
@@ -2023,7 +2023,7 @@
         <w:behaviors>
           <w:behavior w:val="content"/>
         </w:behaviors>
-        <w:guid w:val="{68A611FC-CF36-4BAD-8294-ACCF5ED459A1}"/>
+        <w:guid w:val="{760DFB4C-5EA6-4C83-8ECA-A5A5F94D55EE}"/>
       </w:docPartPr>
       <w:docPartBody>
         <w:p>
@@ -2094,9 +2094,9 @@
     <w:compatSetting w:name="useWord2013TrackBottomHyphenation" w:uri="http://schemas.microsoft.com/office/word" w:val="0"/>
   </w:compat>
   <w:rsids>
-    <w:rsidRoot w:val="00DD32EE"/>
-    <w:rsid w:val="00B8618D"/>
-    <w:rsid w:val="00DD32EE"/>
+    <w:rsidRoot w:val="00513168"/>
+    <w:rsid w:val="00513168"/>
+    <w:rsid w:val="00910422"/>
   </w:rsids>
   <m:mathPr>
     <m:mathFont m:val="Cambria Math"/>
@@ -2555,7 +2555,7 @@
     <w:basedOn w:val="a0"/>
     <w:uiPriority w:val="99"/>
     <w:semiHidden/>
-    <w:rsid w:val="00DD32EE"/>
+    <w:rsid w:val="00513168"/>
     <w:rPr>
       <w:color w:val="666666"/>
     </w:rPr>
@@ -2887,119 +2887,119 @@
 
 <file path=customXml/item1.xml><?xml version="1.0" encoding="utf-8"?>
 <lsno:manifest xmlns:lsno="urn:latexsnipper:office:objects:v3">
-  <formula id="ec1d330a76f34feaa9753421e71f9a80" revision="0" storageMode="ole" schemaVersion="3">
+  <formula id="e0a87c0de8a84726bdd0d21803885e40" revision="0" storageMode="ole" schemaVersion="3">
     <latex>x^{\vec v}</latex>
     <display>inline</display>
-    <payload>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</payload>
-    <locator host="word" objectName="LSNO_ec1d330a76f34feaa9753421e71f9a80" kind="ole"/>
+    <payload>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</payload>
+    <locator host="word" objectName="LSNO_e0a87c0de8a84726bdd0d21803885e40" kind="ole"/>
   </formula>
-  <formula id="d7ddfa2c0aca4783a55ebe4bcad80de4" revision="0" storageMode="ole" schemaVersion="3">
+  <formula id="d4e96578cca9427cae4397de0b4275db" revision="0" storageMode="ole" schemaVersion="3">
     <latex>x^{\vec v}</latex>
     <display>block</display>
-    <payload>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</payload>
-    <locator host="word" objectName="LSNO_d7ddfa2c0aca4783a55ebe4bcad80de4" kind="ole"/>
+    <payload>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</payload>
+    <locator host="word" objectName="LSNO_d4e96578cca9427cae4397de0b4275db" kind="ole"/>
   </formula>
-  <formula id="8b4dd5d0a42d40c29ff50a7ca3acf22d" revision="0" storageMode="ole" schemaVersion="3">
+  <formula id="4d6b74f4b5934f589786e72c877dbdad" revision="0" storageMode="ole" schemaVersion="3">
     <latex>x^{\vec v}</latex>
     <display>block</display>
-    <payload>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</payload>
-    <locator host="word" objectName="LSNO_8b4dd5d0a42d40c29ff50a7ca3acf22d" kind="ole"/>
+    <payload>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</payload>
+    <locator host="word" objectName="LSNO_4d6b74f4b5934f589786e72c877dbdad" kind="ole"/>
   </formula>
-  <formula id="bd7163bcc9274efb947c6d390a311a72" revision="0" storageMode="ole" schemaVersion="3">
+  <formula id="90494c9408c24dba8f91741493b2826a" revision="0" storageMode="ole" schemaVersion="3">
     <latex>\lim_{x\to1}\frac{\sin x}{x}</latex>
     <display>inline</display>
-    <payload>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</payload>
-    <locator host="word" objectName="LSNO_bd7163bcc9274efb947c6d390a311a72" kind="ole"/>
+    <payload>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</payload>
+    <locator host="word" objectName="LSNO_90494c9408c24dba8f91741493b2826a" kind="ole"/>
   </formula>
-  <formula id="9cd83a7283da412789d8dce3a691b97c" revision="0" storageMode="ole" schemaVersion="3">
+  <formula id="55db5e5086914be3997d207b87978614" revision="0" storageMode="ole" schemaVersion="3">
     <latex>\lim_{x\to1}\frac{\sin x}{x}</latex>
     <display>block</display>
-    <payload>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</payload>
-    <locator host="word" objectName="LSNO_9cd83a7283da412789d8dce3a691b97c" kind="ole"/>
+    <payload>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</payload>
+    <locator host="word" objectName="LSNO_55db5e5086914be3997d207b87978614" kind="ole"/>
   </formula>
-  <formula id="dcb961cb2f6641a4868a7e5c39b96656" revision="0" storageMode="ole" schemaVersion="3">
+  <formula id="302814f4ba334950ad82ac565cd6d47c" revision="0" storageMode="ole" schemaVersion="3">
     <latex>\lim_{x\to1}\frac{\sin x}{x}</latex>
     <display>block</display>
-    <payload>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</payload>
-    <locator host="word" objectName="LSNO_dcb961cb2f6641a4868a7e5c39b96656" kind="ole"/>
+    <payload>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</payload>
+    <locator host="word" objectName="LSNO_302814f4ba334950ad82ac565cd6d47c" kind="ole"/>
   </formula>
-  <formula id="a794cd2cf5a7415888e5c6e3091c39a8" revision="0" storageMode="ole" schemaVersion="3">
+  <formula id="8632fcb77a0b4648a76290f7cac37192" revision="0" storageMode="ole" schemaVersion="3">
     <latex>f(x)=\begin{cases}x^2&amp;x\geq0\\-x&amp;x&lt;0\end{cases}</latex>
     <display>inline</display>
-    <payload>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</payload>
-    <locator host="word" objectName="LSNO_a794cd2cf5a7415888e5c6e3091c39a8" kind="ole"/>
+    <payload>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</payload>
+    <locator host="word" objectName="LSNO_8632fcb77a0b4648a76290f7cac37192" kind="ole"/>
   </formula>
-  <formula id="534ddd95cf2e491287c67c974a432b6a" revision="0" storageMode="ole" schemaVersion="3">
+  <formula id="6a50d15ef40249c787072084bde3f5e1" revision="0" storageMode="ole" schemaVersion="3">
     <latex>f(x)=\begin{cases}x^2&amp;x\geq0\\-x&amp;x&lt;0\end{cases}</latex>
     <display>block</display>
-    <payload>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</payload>
-    <locator host="word" objectName="LSNO_534ddd95cf2e491287c67c974a432b6a" kind="ole"/>
+    <payload>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</payload>
+    <locator host="word" objectName="LSNO_6a50d15ef40249c787072084bde3f5e1" kind="ole"/>
   </formula>
-  <formula id="43875f501d67458aa9a1c53ddb62385a" revision="0" storageMode="ole" schemaVersion="3">
+  <formula id="e14273091b3447a4868717623b926d12" revision="0" storageMode="ole" schemaVersion="3">
     <latex>f(x)=\begin{cases}x^2&amp;x\geq0\\-x&amp;x&lt;0\end{cases}</latex>
     <display>block</display>
-    <payload>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</payload>
-    <locator host="word" objectName="LSNO_43875f501d67458aa9a1c53ddb62385a" kind="ole"/>
+    <payload>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</payload>
+    <locator host="word" objectName="LSNO_e14273091b3447a4868717623b926d12" kind="ole"/>
   </formula>
-  <formula id="1c042225ef854f7089d83c79cccad10c" revision="0" storageMode="ole" schemaVersion="3">
+  <formula id="3d0627d57a5c4fd78930540067737789" revision="0" storageMode="ole" schemaVersion="3">
     <latex>\int_0^\infty e^{-x}\,dx=\sum_{n=1}^{\infty}\frac1{2^n}</latex>
     <display>inline</display>
-    <payload>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</payload>
-    <locator host="word" objectName="LSNO_1c042225ef854f7089d83c79cccad10c" kind="ole"/>
+    <payload>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</payload>
+    <locator host="word" objectName="LSNO_3d0627d57a5c4fd78930540067737789" kind="ole"/>
   </formula>
-  <formula id="00bbc087cb284e8482835c55acca09cb" revision="0" storageMode="ole" schemaVersion="3">
+  <formula id="6d3194a84b2848bd9f722ddd953019dd" revision="0" storageMode="ole" schemaVersion="3">
     <latex>\int_0^\infty e^{-x}\,dx=\sum_{n=1}^{\infty}\frac1{2^n}</latex>
     <display>block</display>
-    <payload>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</payload>
-    <locator host="word" objectName="LSNO_00bbc087cb284e8482835c55acca09cb" kind="ole"/>
+    <payload>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</payload>
+    <locator host="word" objectName="LSNO_6d3194a84b2848bd9f722ddd953019dd" kind="ole"/>
   </formula>
-  <formula id="5d5efc9856c04a12bb5f2b2fb9d04fd0" revision="0" storageMode="ole" schemaVersion="3">
+  <formula id="704c1e5a9f2847b3869bf9b26914c04e" revision="0" storageMode="ole" schemaVersion="3">
     <latex>\int_0^\infty e^{-x}\,dx=\sum_{n=1}^{\infty}\frac1{2^n}</latex>
     <display>block</display>
-    <payload>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</payload>
-    <locator host="word" objectName="LSNO_5d5efc9856c04a12bb5f2b2fb9d04fd0" kind="ole"/>
+    <payload>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</payload>
+    <locator host="word" objectName="LSNO_704c1e5a9f2847b3869bf9b26914c04e" kind="ole"/>
   </formula>
-  <formula id="0882ec11366f448781c463049dcae2c0" revision="0" storageMode="ole" schemaVersion="3">
+  <formula id="30c88d8341b340f3873cd1e10fbb489c" revision="0" storageMode="ole" schemaVersion="3">
     <latex>x_1^2+x_2^2+x_3^2+x_4^2+x_5^2+x_6^2+x_7^2+x_8^2+x_9^2+x_{10}^2+x_{11}^2+x_{12}^2+x_{13}^2+x_{14}^2+x_{15}^2+x_{16}^2+x_{17}^2+x_{18}^2+x_{19}^2+x_{20}^2+x_{21}^2+x_{22}^2+x_{23}^2+x_{24}^2+x_{25}^2+x_{26}^2+x_{27}^2+x_{28}^2+x_{29}^2+x_{30}^2+x_{31}^2+x_{32}^2</latex>
     <display>inline</display>
-    <payload>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</payload>
-    <locator host="word" objectName="LSNO_0882ec11366f448781c463049dcae2c0" kind="ole"/>
+    <payload>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</payload>
+    <locator host="word" objectName="LSNO_30c88d8341b340f3873cd1e10fbb489c" kind="ole"/>
   </formula>
-  <formula id="6016153ec3894704968bf377daa7429f" revision="0" storageMode="ole" schemaVersion="3">
+  <formula id="2a97755e8fcd4731aea2633647caef23" revision="0" storageMode="ole" schemaVersion="3">
     <latex>x_1^2+x_2^2+x_3^2+x_4^2+x_5^2+x_6^2+x_7^2+x_8^2+x_9^2+x_{10}^2+x_{11}^2+x_{12}^2+x_{13}^2+x_{14}^2+x_{15}^2+x_{16}^2+x_{17}^2+x_{18}^2+x_{19}^2+x_{20}^2+x_{21}^2+x_{22}^2+x_{23}^2+x_{24}^2+x_{25}^2+x_{26}^2+x_{27}^2+x_{28}^2+x_{29}^2+x_{30}^2+x_{31}^2+x_{32}^2</latex>
     <display>block</display>
-    <payload>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</payload>
-    <locator host="word" objectName="LSNO_6016153ec3894704968bf377daa7429f" kind="ole"/>
+    <payload>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</payload>
+    <locator host="word" objectName="LSNO_2a97755e8fcd4731aea2633647caef23" kind="ole"/>
   </formula>
-  <formula id="e86aba83fb424474bfa4eaf2b22e47db" revision="0" storageMode="ole" schemaVersion="3">
+  <formula id="d2b37b9aa58d46d1b814c38a2d4a3d1b" revision="0" storageMode="ole" schemaVersion="3">
     <latex>x_1^2+x_2^2+x_3^2+x_4^2+x_5^2+x_6^2+x_7^2+x_8^2+x_9^2+x_{10}^2+x_{11}^2+x_{12}^2+x_{13}^2+x_{14}^2+x_{15}^2+x_{16}^2+x_{17}^2+x_{18}^2+x_{19}^2+x_{20}^2+x_{21}^2+x_{22}^2+x_{23}^2+x_{24}^2+x_{25}^2+x_{26}^2+x_{27}^2+x_{28}^2+x_{29}^2+x_{30}^2+x_{31}^2+x_{32}^2</latex>
     <display>block</display>
-    <payload>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</payload>
-    <locator host="word" objectName="LSNO_e86aba83fb424474bfa4eaf2b22e47db" kind="ole"/>
+    <payload>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</payload>
+    <locator host="word" objectName="LSNO_d2b37b9aa58d46d1b814c38a2d4a3d1b" kind="ole"/>
   </formula>
-  <formula id="8a0926c8eb664f8db577db0e95c0f969" revision="0" storageMode="ole" schemaVersion="3">
+  <formula id="c9f456c09526453095a5e53c907fe980" revision="0" storageMode="ole" schemaVersion="3">
     <latex>\cfrac{1}{1+\cfrac{1}{2+\cfrac{1}{3+\cfrac{1}{4+\cfrac{1}{5+\cfrac{1}{6+\cfrac{1}{7+\cfrac{1}{8+\cfrac{1}{9+\cfrac{1}{10+\cfrac{1}{11+\cfrac{1}{12+x}}}}}}}}}}}}</latex>
     <display>inline</display>
-    <payload>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</payload>
-    <locator host="word" objectName="LSNO_8a0926c8eb664f8db577db0e95c0f969" kind="ole"/>
+    <payload>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</payload>
+    <locator host="word" objectName="LSNO_c9f456c09526453095a5e53c907fe980" kind="ole"/>
   </formula>
-  <formula id="55a7bdb781014e02925f45041dbe234a" revision="0" storageMode="ole" schemaVersion="3">
+  <formula id="a180bea120b64ce594a0512e14b9bab4" revision="0" storageMode="ole" schemaVersion="3">
     <latex>\cfrac{1}{1+\cfrac{1}{2+\cfrac{1}{3+\cfrac{1}{4+\cfrac{1}{5+\cfrac{1}{6+\cfrac{1}{7+\cfrac{1}{8+\cfrac{1}{9+\cfrac{1}{10+\cfrac{1}{11+\cfrac{1}{12+x}}}}}}}}}}}}</latex>
     <display>block</display>
-    <payload>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</payload>
-    <locator host="word" objectName="LSNO_55a7bdb781014e02925f45041dbe234a" kind="ole"/>
+    <payload>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</payload>
+    <locator host="word" objectName="LSNO_a180bea120b64ce594a0512e14b9bab4" kind="ole"/>
   </formula>
-  <formula id="383b9b11d40a4097832e446ce4d0022d" revision="0" storageMode="ole" schemaVersion="3">
+  <formula id="59bbab87267a41bda0453a473bacf9eb" revision="0" storageMode="ole" schemaVersion="3">
     <latex>\cfrac{1}{1+\cfrac{1}{2+\cfrac{1}{3+\cfrac{1}{4+\cfrac{1}{5+\cfrac{1}{6+\cfrac{1}{7+\cfrac{1}{8+\cfrac{1}{9+\cfrac{1}{10+\cfrac{1}{11+\cfrac{1}{12+x}}}}}}}}}}}}</latex>
     <display>block</display>
-    <payload>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</payload>
-    <locator host="word" objectName="LSNO_383b9b11d40a4097832e446ce4d0022d" kind="ole"/>
+    <payload>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</payload>
+    <locator host="word" objectName="LSNO_59bbab87267a41bda0453a473bacf9eb" kind="ole"/>
   </formula>
 </lsno:manifest>
 </file>
 
 <file path=customXml/itemProps1.xml><?xml version="1.0" encoding="utf-8"?>
-<ds:datastoreItem xmlns:ds="http://schemas.openxmlformats.org/officeDocument/2006/customXml" ds:itemID="{DEC2E0EF-A651-402C-8551-73CC6F27BD46}">
+<ds:datastoreItem xmlns:ds="http://schemas.openxmlformats.org/officeDocument/2006/customXml" ds:itemID="{1AA187CD-68F6-4497-8F4C-0FB96CD8BFA5}">
   <ds:schemaRefs>
     <ds:schemaRef ds:uri="urn:latexsnipper:office:objects:v3"/>
   </ds:schemaRefs>

</xml_diff>